<commit_message>
Approval letter: no clinic patients; survey already done with 50 respondents
Co-Authored-By: Claude Opus 5.5 <noreply@anthropic.com>
Claude-Session: https://claude.ai/code/session_01XYjf7gc4Be4qnQkPAWZQx2
</commit_message>
<xml_diff>
--- a/ToothWise_Clinic_Approval_Letter.docx
+++ b/ToothWise_Clinic_Approval_Letter.docx
@@ -177,7 +177,7 @@
         <w:rPr/>
         <w:t>2.</w:t>
         <w:tab/>
-        <w:t>pilot the system with the clinic's dentist, dental assistants, and receptionist, and with patients who give their written informed consent;</w:t>
+        <w:t>demonstrate and pilot the system with the clinic's dentist, dental assistants, and receptionist, using sample dental images only; and</w:t>
       </w:r>
     </w:p>
     <w:p>
@@ -195,25 +195,7 @@
         <w:rPr/>
         <w:t>3.</w:t>
         <w:tab/>
-        <w:t>administer the ISO/IEC 25010 software quality evaluation questionnaire to clinic staff and consenting patients; and</w:t>
-      </w:r>
-    </w:p>
-    <w:p>
-      <w:pPr>
-        <w:keepNext w:val="0"/>
-        <w:widowControl/>
-        <w:tabs>
-          <w:tab w:pos="1224" w:val="left"/>
-        </w:tabs>
-        <w:spacing w:before="0" w:after="60" w:line="276" w:lineRule="auto"/>
-        <w:ind w:hanging="432" w:left="1224"/>
-        <w:jc w:val="both"/>
-      </w:pPr>
-      <w:r>
-        <w:rPr/>
-        <w:t>4.</w:t>
-        <w:tab/>
-        <w:t>compare Toothwise-assisted screening with the current manual process in terms of screening time and consistency, using the dentist's findings as the reference.</w:t>
+        <w:t>consult the clinic's dentist on the system's detection results, risk classification, and prevention plans so that they reflect sound clinical practice.</w:t>
       </w:r>
     </w:p>
     <w:p>
@@ -226,7 +208,7 @@
       </w:pPr>
       <w:r>
         <w:rPr/>
-        <w:t>All information gathered will be kept strictly confidential and used solely for academic purposes, in accordance with the Data Privacy Act of 2012 (Republic Act No. 10173). No patient photograph or record will be used without the patient's consent, data presented in the paper will be anonymized, and the study will be scheduled so as not to disrupt the clinic's daily operations.</w:t>
+        <w:t>The study does not involve the clinic's patients. The ISO/IEC 25010 software quality evaluation has already been answered by 50 respondents from outside the clinic, so no patient photograph, record, or personal information from CodiSmile Dental Clinic will be collected. Any information shared with us will be kept strictly confidential and used solely for academic purposes, in accordance with the Data Privacy Act of 2012 (Republic Act No. 10173), and all activities will be scheduled so as not to disrupt the clinic's daily operations.</w:t>
       </w:r>
     </w:p>
     <w:p>

</xml_diff>